<commit_message>
docs: final consistency fixes after the last review
- R2 test descriptions cover the allowlisted-gNB reclaim and IPv6 transport
- LAB_GUIDE: both live runs matched the offline pass; detector heartbeats
- manuscript_v2: allowlist reasoning matches the final R2 rule
- PAPER: one pip install command, as in the other guides
- ignore editor lock files
</commit_message>
<xml_diff>
--- a/paper/paper_humanized.docx
+++ b/paper/paper_humanized.docx
@@ -689,22 +689,16 @@
         <w:t xml:space="preserve"> </w:t>
       </w:r>
       <w:r>
-        <w:t xml:space="preserve">detector's blind spots plainly. All of it runs with two</w:t>
-      </w:r>
-      <w:r>
-        <w:t xml:space="preserve"> </w:t>
-      </w:r>
-      <w:r>
-        <w:rPr>
-          <w:rStyle w:val="VerbatimChar"/>
-        </w:rPr>
-        <w:t xml:space="preserve">pip install</w:t>
-      </w:r>
-      <w:r>
-        <w:t xml:space="preserve"> </w:t>
-      </w:r>
-      <w:r>
-        <w:t xml:space="preserve">commands</w:t>
+        <w:t xml:space="preserve">detector's blind spots plainly. All of it runs with a single</w:t>
+      </w:r>
+      <w:r>
+        <w:t xml:space="preserve"> </w:t>
+      </w:r>
+      <w:r>
+        <w:rPr>
+          <w:rStyle w:val="VerbatimChar"/>
+        </w:rPr>
+        <w:t xml:space="preserve">pip install scapy pytest</w:t>
       </w:r>
       <w:r>
         <w:t xml:space="preserve"> </w:t>
@@ -4390,22 +4384,22 @@
         <w:pStyle w:val="BodyText"/>
       </w:pPr>
       <w:r>
-        <w:t xml:space="preserve">All of Section 6.1 is reproducible with two</w:t>
-      </w:r>
-      <w:r>
-        <w:t xml:space="preserve"> </w:t>
-      </w:r>
-      <w:r>
-        <w:rPr>
-          <w:rStyle w:val="VerbatimChar"/>
-        </w:rPr>
-        <w:t xml:space="preserve">pip install</w:t>
-      </w:r>
-      <w:r>
-        <w:t xml:space="preserve"> </w:t>
-      </w:r>
-      <w:r>
-        <w:t xml:space="preserve">commands and no Docker,</w:t>
+        <w:t xml:space="preserve">All of Section 6.1 is reproducible with a single</w:t>
+      </w:r>
+      <w:r>
+        <w:t xml:space="preserve"> </w:t>
+      </w:r>
+      <w:r>
+        <w:rPr>
+          <w:rStyle w:val="VerbatimChar"/>
+        </w:rPr>
+        <w:t xml:space="preserve">pip install scapy pytest</w:t>
+      </w:r>
+      <w:r>
+        <w:t xml:space="preserve"> </w:t>
+      </w:r>
+      <w:r>
+        <w:t xml:space="preserve">and no Docker,</w:t>
       </w:r>
       <w:r>
         <w:t xml:space="preserve"> </w:t>

</xml_diff>